<commit_message>
Doc/fw_status: finalize HV_Sense as 0.245 V (R3003 50k->5k next schematic rev)
HW owner will change R3003 to 5k so the divider is 1:2000 (10M:5k) and
HV_Sense = 0.245 V @500 V (ratio 0.00049). Replaced the "decision required"
wording in the operation doc and fw_status with the confirmed scaling and an
in-progress note on the resistor change. Firmware keeps the 0.245 V scaling.

Co-Authored-By: Claude Opus 4.8 <noreply@anthropic.com>
</commit_message>
<xml_diff>
--- a/Doc/Harness_Tester_Operation_Document_v1.3.docx
+++ b/Doc/Harness_Tester_Operation_Document_v1.3.docx
@@ -235,10 +235,7 @@
     </w:p>
     <w:p>
       <w:r>
-        <w:rPr>
-          <w:b w:val="0"/>
-        </w:rPr>
-        <w:t>1. HV_Sense divider: target is ~0.245 V at 500 V (ratio ~0.00049). As drawn R3001 = 10 M with R3003 = 50 k gives 2.49 V (x10). Correct the schematic to a ~1:2000 ratio (R3003 = 5 k, or R3001 = 100 M) and confirm the fitted parts; firmware scales to the populated resistors. See Sec. 3.2.</w:t>
+        <w:t>1. HV_Sense divider (being fixed): 0.245 V at 500 V, ratio 0.00049 (1:2000 divider). R3003 is being changed from 50 kΩ to 5 kΩ in the next schematic revision (10 MΩ : 5 kΩ); the drawn 50 kΩ would give 2.49 V (×10). Firmware uses the 0.245 V scaling. See Sec. 3.2.</w:t>
       </w:r>
     </w:p>
     <w:p>
@@ -3485,7 +3482,7 @@
         <w:t>FIRMWARE REVIEW NOTE (v1.3):</w:t>
       </w:r>
       <w:r>
-        <w:t xml:space="preserve"> HV_Sense = HV × R3003 / (R3001 + R3003). The intended scaling is HV × ~0.00049 ≈ 0.245 V at 500 V (as annotated on the schematic and used in the table above), which needs a divider ratio of ~1:2000, e.g. R3001 = 10 MΩ with R3003 = 5 kΩ. AS DRAWN on HV_Card sheet 2 the pair is R3001 = 10 MΩ and R3003 = 50 kΩ, a ~1:200 ratio that would instead give ≈ 2.49 V at 500 V (×10). ACTION: correct the schematic so the divider matches 0.245 V (R3003 = 5 kΩ, or R3001 = 100 MΩ) and confirm the fitted parts; firmware HV_Sense scaling must match the resistors actually populated. Either level sits well inside the 5 V ADC reference.</w:t>
+        <w:t xml:space="preserve"> HV_Sense = HV × R3003 / (R3001 + R3003) = HV × 0.00049 ≈ 0.245 V at 500 V — a 1:2000 divider (R3001 = 10 MΩ, R3003 = 5 kΩ). NOTE: the present HV_Card sheet 2 labels R3003 = 50 kΩ (a 1:200 ratio that would give ≈ 2.49 V, ×10); R3003 is being changed to 5 kΩ in the next schematic revision. Firmware uses the 0.245 V / 0.00049 scaling; the reading sits well inside the 5 V ADC reference.</w:t>
       </w:r>
     </w:p>
     <w:p>

</xml_diff>

<commit_message>
Doc/fw_status: LO_COM pull-down = 100 ohm; add resistance self-cal plan
Per hardware decision, LO_COM pull-down is 100 ohm (was 100k):
- It defines the current-source return AND the continuity low leg, and sits
  inside the 2-wire resistance sense path (U33 reads HI_COM vs GND).
- Continuity: connected node now well below the old 1.5 V (a few hundred mV,
  or tens of mV with low-Ron muxes); interpretation table + notes updated to
  "connected < ~0.5 V, open ~3.3 V, calibrate at bring-up".
- Resistance: documented that 100 ohm lets current flow but compliance is
  separate from calibration - with high mux Ron (CD4067B ~500 ohm) the node
  still clamps at 10 mA; need low-Ron mux / lower current. Added the planned
  reference-resistor self-calibration (GPIO-driven CD4067 + known wire per
  side) with the key caveat that the cal path must traverse the same switches
  as the measure path.

Co-Authored-By: Claude Opus 4.8 <noreply@anthropic.com>
</commit_message>
<xml_diff>
--- a/Doc/Harness_Tester_Operation_Document_v1.3.docx
+++ b/Doc/Harness_Tester_Operation_Document_v1.3.docx
@@ -264,10 +264,7 @@
     </w:p>
     <w:p>
       <w:r>
-        <w:rPr>
-          <w:b w:val="0"/>
-        </w:rPr>
-        <w:t>5. Continuity level (RESOLVED): the ~1.5 V "connected" reading is the divider of the Control-side ~10 kΩ pull-up (to 3.3 V) against the Matrix low-side pull-down; wire + mux resistance is small versus those pulls, so only minor variation is expected. Keep the 1.3–1.7 V band. See Sec. 6.</w:t>
+        <w:t>5. Continuity level (RESOLVED): LO_COM pull-down = 100 Ω. A present wire pulls the sense node well below 3.3 V (a few hundred mV, or less with low-Rₒₙ muxes); an open stays ≈ 3.3 V. Large margin — calibrate the connected/open thresholds at bring-up. See Sec. 6.</w:t>
       </w:r>
     </w:p>
     <w:p>
@@ -5517,7 +5514,7 @@
         <w:t>FIRMWARE REVIEW NOTE (v1.3):</w:t>
       </w:r>
       <w:r>
-        <w:t xml:space="preserve"> The "connected ≈ 1.5 V" level is set by the divider between the Control-side ~10 kΩ pull-up (to 3.3 V) and the pull-down on the Matrix low-side (LO_COM / LS CD4067). The harness wire + mux on-resistance is small compared with those pull resistors, so it shifts the reading only slightly — expect minor variation around ~1.5 V (hence the 1.3–1.7 V band); an open path is pull-up only ≈ 3.3 V. Detection is robust; the band is fine as specified.</w:t>
+        <w:t xml:space="preserve"> LO_COM carries a 100 Ω pull-down to GND (hardware decision), which doubles as the current-source return. In continuity mode the "connected" node is the divider of the ~10 kΩ pull-up (Control, to 3.3 V) against (2·mux Rₒₙ + 100 Ω) — so a present wire reads WELL BELOW the old 1.5 V figure (a few hundred mV, or tens of mV with low-Rₒₙ muxes), while an open reads ≈ 3.3 V (pull-up only). Margin is large; set the connected/open thresholds from a bring-up loopback, not a fixed 1.5 V.</w:t>
       </w:r>
     </w:p>
     <w:p>
@@ -5613,7 +5610,7 @@
                 <w:sz w:val="20"/>
                 <w:szCs w:val="20"/>
               </w:rPr>
-              <w:t xml:space="preserve">3.0 V – 3.3 V</w:t>
+              <w:t>≈ 3.3 V</w:t>
             </w:r>
           </w:p>
         </w:tc>
@@ -5630,7 +5627,7 @@
                 <w:sz w:val="20"/>
                 <w:szCs w:val="20"/>
               </w:rPr>
-              <w:t xml:space="preserve">Open — no harness connection</w:t>
+              <w:t>Open — no harness connection</w:t>
             </w:r>
           </w:p>
         </w:tc>
@@ -5647,7 +5644,7 @@
                 <w:sz w:val="20"/>
                 <w:szCs w:val="20"/>
               </w:rPr>
-              <w:t xml:space="preserve">No wire on this path</w:t>
+              <w:t>No wire on this path</w:t>
             </w:r>
           </w:p>
         </w:tc>
@@ -5667,7 +5664,7 @@
                 <w:sz w:val="20"/>
                 <w:szCs w:val="20"/>
               </w:rPr>
-              <w:t xml:space="preserve">1.3 V – 1.7 V</w:t>
+              <w:t>&lt; ~0.5 V</w:t>
             </w:r>
           </w:p>
         </w:tc>
@@ -5684,7 +5681,7 @@
                 <w:sz w:val="20"/>
                 <w:szCs w:val="20"/>
               </w:rPr>
-              <w:t xml:space="preserve">Connected — wire present</w:t>
+              <w:t>Connected — wire present</w:t>
             </w:r>
           </w:p>
         </w:tc>
@@ -5701,7 +5698,7 @@
                 <w:sz w:val="20"/>
                 <w:szCs w:val="20"/>
               </w:rPr>
-              <w:t xml:space="preserve">Connection confirmed</w:t>
+              <w:t>Connection confirmed (level set by mux Rₒₙ vs the 100 Ω LO_COM return)</w:t>
             </w:r>
           </w:p>
         </w:tc>
@@ -5721,7 +5718,7 @@
                 <w:sz w:val="20"/>
                 <w:szCs w:val="20"/>
               </w:rPr>
-              <w:t xml:space="preserve">&lt; 1.0 V or &gt; 1.9 V</w:t>
+              <w:t>~0.5 – 3.0 V</w:t>
             </w:r>
           </w:p>
         </w:tc>
@@ -5738,7 +5735,7 @@
                 <w:sz w:val="20"/>
                 <w:szCs w:val="20"/>
               </w:rPr>
-              <w:t xml:space="preserve">Anomalous</w:t>
+              <w:t>Anomalous / high-resistance</w:t>
             </w:r>
           </w:p>
         </w:tc>
@@ -5755,7 +5752,7 @@
                 <w:sz w:val="20"/>
                 <w:szCs w:val="20"/>
               </w:rPr>
-              <w:t xml:space="preserve">Log as anomaly — investigate relay or wiring</w:t>
+              <w:t>Log — partial or degraded connection; investigate</w:t>
             </w:r>
           </w:p>
         </w:tc>
@@ -6392,10 +6389,10 @@
           <w:color w:val="B00000"/>
           <w:highlight w:val="yellow"/>
         </w:rPr>
-        <w:t>FIRMWARE REVIEW NOTE (v1.3) — VERIFY AT BRING-UP:</w:t>
-      </w:r>
-      <w:r>
-        <w:t xml:space="preserve"> The DAC8775 current source regulates to 10 mA within its compliance, driving whatever voltage the path needs; the design intent is that the drop stays inside the ~3.3 V mux headroom. The current path DAC I_OUT → HI_COM → HI mux → HS wire → LS wire → LO mux → LO_COM crosses TWO CD4067 switches powered from +3V3, so the item to VERIFY is their combined on-resistance: with a 0 Ω loopback, confirm V_HI_COM at 10 mA is comfortably below 3.3 V (i.e. 2·R_on(mux) + R_wire is small). If the node clamps at the rail, reduce the test current. Either way, characterise the two-mux on-resistance and subtract it: R_wire = V_drop / I − R_offset. Fold R_offset into the Sec. 7.1 calibration.</w:t>
+        <w:t>FIRMWARE REVIEW NOTE (v1.3) — RESISTANCE PATH &amp; CALIBRATION:</w:t>
+      </w:r>
+      <w:r>
+        <w:t xml:space="preserve"> Single-ended, 2-wire: U33 reads HI_COM to GND, so the reading = I × (2·mux Rₒₙ + 100 Ω LO_COM return + R_wire). The 100 Ω return lets current flow (the old 100 kΩ made 10 mA impossible). BUT compliance is separate from calibration: if mux Rₒₙ is high (classic CD4067B ≈ 500 Ω → ~1.1 kΩ offset) the node needs ~11 V at 10 mA and clamps at 3.3 V, so the current collapses no matter how you calibrate. Keep I × (offset + R_wire) &lt; ~3.3 V via low-Rₒₙ muxes (~15 Ω) and/or lower current. THEN a reference-resistor self-calibration (planned: a permanent known-resistance path per side, selected by a GPIO-driven CD4067, measured before each test to characterise and subtract the offset) removes the offset and its drift, leaving the ADC step (LSB/I ≈ 80 mΩ at 10 mA) as the floor — good for connection/ohms-range resistance, not milliohm. IMPORTANT: the calibration path must traverse the SAME switches as the measurement path, else the main-mux Rₒₙ is not cancelled. For true milliohm precision, use 4-wire (Kelvin).</w:t>
       </w:r>
     </w:p>
     <w:p>

</xml_diff>